<commit_message>
Retrait de /demo.html : elle était publique et menait chez un tiers
La page portait les identifiants de la démonstration et son bouton pointait vers
demo.filum.app — un domaine qui n'appartient pas à l'éditeur. Elle n'était liée
depuis nulle part, mais une page orpheline reste une page publiée. Elle reviendra
le jour où la démonstration sera annoncée sous une adresse dont on dispose.

Co-Authored-By: Claude Opus 5 <noreply@anthropic.com>
</commit_message>
<xml_diff>
--- a/docs/Filum_scope_note.docx
+++ b/docs/Filum_scope_note.docx
@@ -58,7 +58,7 @@
           <w:sz w:val="20"/>
           <w:szCs w:val="20"/>
         </w:rPr>
-        <w:t xml:space="preserve">A demonstration given to somebody who was looking for something else costs two hours on both sides and leaves a bad taste. This document exists to avoid that. Everything under “what is in place” can be shown on screen in under a minute; everything under “what does not exist” is true as of 9 August 2026, with no “coming soon” and no “on the roadmap”.</w:t>
+        <w:t xml:space="preserve">A demonstration given to somebody who was looking for something else costs two hours on both sides and leaves a bad taste. This document exists to avoid that. Everything under “what is in place” can be shown on screen in under a minute; everything under “what does not exist” is true as of 22 August 2026, with no “coming soon” and no “on the roadmap”.</w:t>
       </w:r>
     </w:p>
     <w:p>
@@ -1607,7 +1607,7 @@
           <w:sz w:val="17"/>
           <w:szCs w:val="17"/>
         </w:rPr>
-        <w:t xml:space="preserve">This document describes the software at version 1.2.1, as of 9 August 2026. It is regenerated from the product repository rather than maintained by hand: any gap between what it announces and what the software does is therefore a defect, not marketing licence. If the copy you hold is older than your installation, ask us for the current note.</w:t>
+        <w:t xml:space="preserve">This document describes the software at version 1.2.1, as of 22 August 2026. It is regenerated from the product repository rather than maintained by hand: any gap between what it announces and what the software does is therefore a defect, not marketing licence. If the copy you hold is older than your installation, ask us for the current note.</w:t>
       </w:r>
     </w:p>
     <w:sectPr>
@@ -1675,7 +1675,7 @@
         <w:sz w:val="17"/>
         <w:szCs w:val="17"/>
       </w:rPr>
-      <w:t xml:space="preserve">Version 1.2.1   ·   9 August 2026   ·   </w:t>
+      <w:t xml:space="preserve">Version 1.2.1   ·   22 August 2026   ·   </w:t>
     </w:r>
     <w:r>
       <w:rPr>

</xml_diff>

<commit_message>
Périmètre : deux absences affirmées à tort, et Filum n'est pas un ERP
Le document listait « pas d'API publique, pas d'import Word ni Excel » alors que
les deux existent — en se contredisant lui-même quelques lignes plus haut. Corrigé.
Et il dit désormais explicitement que Filum n'est pas un ERP et n'en tient pas lieu :
la question a été posée par le premier lecteur extérieur.

Co-Authored-By: Claude Opus 5 <noreply@anthropic.com>
</commit_message>
<xml_diff>
--- a/docs/Filum_scope_note.docx
+++ b/docs/Filum_scope_note.docx
@@ -58,7 +58,7 @@
           <w:sz w:val="20"/>
           <w:szCs w:val="20"/>
         </w:rPr>
-        <w:t xml:space="preserve">A demonstration given to somebody who was looking for something else costs two hours on both sides and leaves a bad taste. This document exists to avoid that. Everything under “what is in place” can be shown on screen in under a minute; everything under “what does not exist” is true as of 22 August 2026, with no “coming soon” and no “on the roadmap”.</w:t>
+        <w:t xml:space="preserve">A demonstration given to somebody who was looking for something else costs two hours on both sides and leaves a bad taste. This document exists to avoid that. Everything under “what is in place” can be shown on screen in under a minute; everything under “what does not exist” is true as of 23 August 2026, with no “coming soon” and no “on the roadmap”.</w:t>
       </w:r>
     </w:p>
     <w:p>
@@ -867,7 +867,7 @@
           <w:sz w:val="20"/>
           <w:szCs w:val="20"/>
         </w:rPr>
-        <w:t xml:space="preserve">No integrations</w:t>
+        <w:t xml:space="preserve">No integration with your information system</w:t>
       </w:r>
     </w:p>
     <w:p>
@@ -879,7 +879,8 @@
           <w:sz w:val="20"/>
           <w:szCs w:val="20"/>
         </w:rPr>
-        <w:t xml:space="preserve">No public API, no webhooks, no PLM, ERP or ALM connector, no ReqIF, no Word or Excel (.xlsx) import. Data migration goes through CSV files.</w:t>
+        <w:t xml:space="preserve">No webhooks, no PLM, ERP or ALM connector, no ReqIF. There is a READ-ONLY API, token-authenticated, to extract programmes, requirements and traceability — it gets data out, it does not bring any in and connects to nothing. Data migration goes through CSV files, or by dropping an .xlsx workbook or a .docx document (see “Migrating your data”).
+AND FILUM IS NOT AN ERP. An ERP handles purchasing, stock, production scheduling, manufactured lots, invoicing and accounting. Filum handles the DESIGN FILE — what comes before production, not what drives it. The two sit side by side in a medical device company; they replace each other on no point, and Filum contributes to no ERP function.</w:t>
       </w:r>
     </w:p>
     <w:p>
@@ -1607,7 +1608,7 @@
           <w:sz w:val="17"/>
           <w:szCs w:val="17"/>
         </w:rPr>
-        <w:t xml:space="preserve">This document describes the software at version 1.2.1, as of 22 August 2026. It is regenerated from the product repository rather than maintained by hand: any gap between what it announces and what the software does is therefore a defect, not marketing licence. If the copy you hold is older than your installation, ask us for the current note.</w:t>
+        <w:t xml:space="preserve">This document describes the software at version 1.2.1, as of 23 August 2026. It is regenerated from the product repository rather than maintained by hand: any gap between what it announces and what the software does is therefore a defect, not marketing licence. If the copy you hold is older than your installation, ask us for the current note.</w:t>
       </w:r>
     </w:p>
     <w:sectPr>
@@ -1675,7 +1676,7 @@
         <w:sz w:val="17"/>
         <w:szCs w:val="17"/>
       </w:rPr>
-      <w:t xml:space="preserve">Version 1.2.1   ·   22 August 2026   ·   </w:t>
+      <w:t xml:space="preserve">Version 1.2.1   ·   23 August 2026   ·   </w:t>
     </w:r>
     <w:r>
       <w:rPr>

</xml_diff>